<commit_message>
docs: update Sprint 3 project evidence dossiers, test execution (94 passed), coverage (80%), CC (Grade A 4.65), and regenerate 8 Word documents
</commit_message>
<xml_diff>
--- a/docs/Code_Coverage_Report.docx
+++ b/docs/Code_Coverage_Report.docx
@@ -27,7 +27,7 @@
           <w:color w:val="0284C7"/>
           <w:sz w:val="24"/>
         </w:rPr>
-        <w:t>Disaster Relief Resource Coordination System (Team 20) — Review 2 Delivery</w:t>
+        <w:t>Disaster Relief Resource Coordination System (Team 20) — Sprint 3 (Review 3) Delivery</w:t>
       </w:r>
     </w:p>
     <w:tbl>
@@ -438,7 +438,7 @@
           <w:color w:val="1E293B"/>
           <w:sz w:val="20"/>
         </w:rPr>
-        <w:t>Code coverage was measured by instrumenting the Python execution environment while executing all 62 automated unit, route, and integration tests. The test suite exercises data models, business logic functions, API routes, session context processors, error handling blocks, and HTML template endpoints.</w:t>
+        <w:t>Code coverage was measured by instrumenting the Python execution environment while executing all 94 automated unit, route, and integration tests. The test suite exercises data models, business logic functions, API routes, session context processors, error handling blocks, and HTML template endpoints.</w:t>
       </w:r>
     </w:p>
     <w:tbl>
@@ -4009,7 +4009,7 @@
         <w:color w:val="64748B"/>
         <w:sz w:val="17"/>
       </w:rPr>
-      <w:t>Software Engineering Project — Review 2 Delivery Evidence</w:t>
+      <w:t>Software Engineering Project — Sprint 3 (Review 3) Delivery Evidence</w:t>
     </w:r>
   </w:p>
 </w:ftr>

</xml_diff>